<commit_message>
docs: cover customer workflow install and manual ZIP upload
</commit_message>
<xml_diff>
--- a/docs/Unravel_Github_Integration_Setup_Guide.docx
+++ b/docs/Unravel_Github_Integration_Setup_Guide.docx
@@ -16,7 +16,7 @@
         <w:pStyle w:val="Subtitle"/>
       </w:pPr>
       <w:r>
-        <w:t>Manual repository ZIP upload to an Azure Databricks Unity Catalog volume</w:t>
+        <w:t>Customer setup, manual workflow runs, and browser upload alternative</w:t>
       </w:r>
     </w:p>
     <w:p>
@@ -27,7 +27,7 @@
         <w:t xml:space="preserve">Purpose  </w:t>
       </w:r>
       <w:r>
-        <w:t>Use this guide to install, configure, run, and verify the Unravel Github Integration workflow. The workflow packages every tracked file at a selected commit into one ZIP and uploads it to a Unity Catalog volume only when a user starts it from GitHub Actions.</w:t>
+        <w:t>Use this guide to install the Unravel Github Integration workflow in a customer GitHub repository, configure it, run it on demand, and verify the uploaded ZIP in a Unity Catalog volume. If GitHub Actions cannot be used, follow Section 6 to download the repository ZIP and upload it through the Databricks browser interface.</w:t>
       </w:r>
     </w:p>
     <w:p>
@@ -35,10 +35,10 @@
         <w:rPr>
           <w:b/>
         </w:rPr>
-        <w:t xml:space="preserve">Current status  </w:t>
+        <w:t xml:space="preserve">Deployment scope  </w:t>
       </w:r>
       <w:r>
-        <w:t>The workflow is already installed in the UnravelCICD repository and one upload completed successfully on 8 October 2026. Use the installation steps when reproducing it in another repository or restoring the file; use the operating steps for routine runs.</w:t>
+        <w:t>UnravelCICD is the tested reference repository. Its workflow and GitHub secrets are not installed in the customer repository. Each customer must add the YAML file to their own repository and create the three secrets there before the Actions route can run. The manual browser route needs no workflow or GitHub Actions secrets.</w:t>
       </w:r>
     </w:p>
     <w:p>
@@ -46,7 +46,7 @@
         <w:rPr>
           <w:b/>
         </w:rPr>
-        <w:t xml:space="preserve">Repository  </w:t>
+        <w:t xml:space="preserve">Reference repository  </w:t>
       </w:r>
       <w:hyperlink r:id="rId9">
         <w:r>
@@ -221,7 +221,7 @@
               <w:rPr>
                 <w:sz w:val="17"/>
               </w:rPr>
-              <w:t>.github/workflows/upload-repo-zip-to-databricks.yml</w:t>
+              <w:t>Customer repository: .github/workflows/upload-repo-zip-to-databricks.yml</w:t>
             </w:r>
           </w:p>
         </w:tc>
@@ -402,7 +402,7 @@
               <w:rPr>
                 <w:sz w:val="17"/>
               </w:rPr>
-              <w:t>Repository Settings &gt; Secrets and variables &gt; Actions</w:t>
+              <w:t>Customer repository Settings &gt; Secrets and variables &gt; Actions</w:t>
             </w:r>
           </w:p>
         </w:tc>
@@ -547,7 +547,15 @@
         <w:pStyle w:val="ListBullet"/>
       </w:pPr>
       <w:r>
-        <w:t>GitHub: you need repository write access to add the YAML, create repository secrets, and start the manual workflow. If main is protected, merge the workflow file through a pull request.</w:t>
+        <w:t>GitHub Actions route: you need access to the customer repository, permission to add the YAML and create repository secrets, and write access to start the workflow. If the default branch is protected, merge the file through a pull request.</w:t>
+      </w:r>
+    </w:p>
+    <w:p>
+      <w:pPr>
+        <w:pStyle w:val="ListBullet"/>
+      </w:pPr>
+      <w:r>
+        <w:t>Browser route: you need access to download the customer repository ZIP and permission to upload to the destination Databricks volume. Sections 1.1 and 1.3 and all GitHub Actions secrets are unnecessary for this route.</w:t>
       </w:r>
     </w:p>
     <w:p>
@@ -1050,7 +1058,7 @@
         <w:pStyle w:val="Heading1"/>
       </w:pPr>
       <w:r>
-        <w:t>2 Add the workflow YAML</w:t>
+        <w:t>2 Install the workflow in the customer repository</w:t>
       </w:r>
     </w:p>
     <w:p>
@@ -1058,10 +1066,10 @@
         <w:rPr>
           <w:b/>
         </w:rPr>
-        <w:t xml:space="preserve">This repository already contains the file. </w:t>
+        <w:t xml:space="preserve">Do this in each customer repository. </w:t>
       </w:r>
       <w:r>
-        <w:t>For a new repository, add exactly one YAML file at .github/workflows/upload-repo-zip-to-databricks.yml. GitHub only discovers workflow files in .github/workflows, and the file must end in .yml or .yaml. The complete YAML appears in Appendix A and is also available in the linked repository file.</w:t>
+        <w:t>The reference repository already contains the file, but its installation does not apply to customer repositories. Add one YAML file at .github/workflows/upload-repo-zip-to-databricks.yml in the customer repository. The complete YAML appears in Appendix A and is also available in the linked reference file.</w:t>
       </w:r>
     </w:p>
     <w:p>
@@ -1071,7 +1079,7 @@
             <w:color w:val="1F4E79"/>
             <w:u w:val="single"/>
           </w:rPr>
-          <w:t>Open the current workflow YAML</w:t>
+          <w:t>Open the reference workflow YAML</w:t>
         </w:r>
       </w:hyperlink>
     </w:p>
@@ -1089,10 +1097,10 @@
         <w:rPr>
           <w:b/>
         </w:rPr>
-        <w:t xml:space="preserve">Open the repository Code tab. </w:t>
+        <w:t xml:space="preserve">Open the customer repository Code tab. </w:t>
       </w:r>
       <w:r>
-        <w:t>Choose the branch where the file will be committed. For the manual Run workflow button to appear, the workflow must be present on the repository default branch.</w:t>
+        <w:t>Choose the branch where the file will be committed. For the manual Run workflow button to appear, the workflow must be present on the customer repository default branch.</w:t>
       </w:r>
     </w:p>
     <w:p>
@@ -1149,10 +1157,10 @@
         <w:rPr>
           <w:b/>
         </w:rPr>
-        <w:t xml:space="preserve">Commit the file. </w:t>
+        <w:t xml:space="preserve">Commit the file in the customer repository. </w:t>
       </w:r>
       <w:r>
-        <w:t>Select Commit changes. Commit to the default branch if allowed, or open and merge a pull request. Verify the file appears in the exact path above.</w:t>
+        <w:t>Select Commit changes. Commit to the default branch if allowed, or open and merge a pull request. Verify the exact path above on the default branch and check that Unravel Github Integration appears in its Actions tab.</w:t>
       </w:r>
     </w:p>
     <w:p>
@@ -1161,7 +1169,7 @@
         <w:keepNext/>
       </w:pPr>
       <w:r>
-        <w:t>Screenshot 4  Workflow file in the repository</w:t>
+        <w:t>Screenshot 4  Workflow file in the customer repository</w:t>
       </w:r>
     </w:p>
     <w:tbl>
@@ -1217,7 +1225,7 @@
                 <w:color w:val="5A626C"/>
                 <w:sz w:val="17"/>
               </w:rPr>
-              <w:t>Capture the Code tab with the .github/workflows path and YAML filename visible.</w:t>
+              <w:t>Capture the customer Code tab with the .github/workflows path and YAML filename visible.</w:t>
             </w:r>
           </w:p>
         </w:tc>
@@ -1250,10 +1258,10 @@
         <w:rPr>
           <w:b/>
         </w:rPr>
-        <w:t xml:space="preserve">Open the repository settings. </w:t>
+        <w:t xml:space="preserve">Open the customer repository settings. </w:t>
       </w:r>
       <w:r>
-        <w:t>On the GitHub repository page, select Settings. In the left sidebar under Security, select Secrets and variables &gt; Actions, then the Secrets tab.</w:t>
+        <w:t>On the customer GitHub repository page, select Settings. In the left sidebar under Security, select Secrets and variables &gt; Actions, then the Secrets tab.</w:t>
       </w:r>
     </w:p>
     <w:p>
@@ -1666,7 +1674,7 @@
         <w:t xml:space="preserve">Confirm the names, not the values. </w:t>
       </w:r>
       <w:r>
-        <w:t>The Secrets page lists DBX_URL, DBX_TOKEN, and DBX_VOLUME_PATH. GitHub does not display the stored values again; to change one, update that secret. These are repository secrets, not Actions variables.</w:t>
+        <w:t>The customer repository Secrets page must list DBX_URL, DBX_TOKEN, and DBX_VOLUME_PATH. Secrets created in UnravelCICD do not carry over. GitHub does not display stored values again; to change one, update that secret. These are repository secrets, not Actions variables.</w:t>
       </w:r>
     </w:p>
     <w:p>
@@ -1764,10 +1772,10 @@
         <w:rPr>
           <w:b/>
         </w:rPr>
-        <w:t xml:space="preserve">Open Actions. </w:t>
+        <w:t xml:space="preserve">Open customer Actions. </w:t>
       </w:r>
       <w:r>
-        <w:t>In the repository, select the Actions tab, then choose Unravel Github Integration in the left workflow list.</w:t>
+        <w:t>In the customer repository, select the Actions tab, then choose Unravel Github Integration in the left workflow list.</w:t>
       </w:r>
     </w:p>
     <w:p>
@@ -2116,6 +2124,355 @@
       <w:pPr>
         <w:spacing w:after="40"/>
       </w:pPr>
+    </w:p>
+    <w:p>
+      <w:pPr>
+        <w:pStyle w:val="Heading1"/>
+      </w:pPr>
+      <w:r>
+        <w:t>6 Manual alternative: browser ZIP upload</w:t>
+      </w:r>
+    </w:p>
+    <w:p>
+      <w:r>
+        <w:rPr>
+          <w:b/>
+        </w:rPr>
+        <w:t xml:space="preserve">Use this route when the workflow cannot be installed or run. </w:t>
+      </w:r>
+      <w:r>
+        <w:t>It needs no GitHub Actions workflow, PAT, or repository secrets. You need read access to the customer repository and USE CATALOG, USE SCHEMA, and WRITE VOLUME for the Databricks destination. The volume must already exist. The browser upload limit is 5 GB per file. Repeat these steps whenever a newer repository snapshot is needed.</w:t>
+      </w:r>
+    </w:p>
+    <w:p>
+      <w:pPr>
+        <w:ind w:left="259" w:hanging="259"/>
+      </w:pPr>
+      <w:r>
+        <w:rPr>
+          <w:b/>
+        </w:rPr>
+        <w:t xml:space="preserve">1. </w:t>
+      </w:r>
+      <w:r>
+        <w:rPr>
+          <w:b/>
+        </w:rPr>
+        <w:t xml:space="preserve">Choose the source version in GitHub. </w:t>
+      </w:r>
+      <w:r>
+        <w:t>Open the customer repository Code tab and use the branch or tag selector to show the version you want. Record its branch or tag and commit ID for traceability.</w:t>
+      </w:r>
+    </w:p>
+    <w:p>
+      <w:pPr>
+        <w:ind w:left="259" w:hanging="259"/>
+      </w:pPr>
+      <w:r>
+        <w:rPr>
+          <w:b/>
+        </w:rPr>
+        <w:t xml:space="preserve">2. </w:t>
+      </w:r>
+      <w:r>
+        <w:rPr>
+          <w:b/>
+        </w:rPr>
+        <w:t xml:space="preserve">Download the repository ZIP. </w:t>
+      </w:r>
+      <w:r>
+        <w:t>Above the file list, select Code &gt; Download ZIP. Save the ZIP to your computer. It is a source snapshot of committed files and has no .git history; keep the ZIP intact for upload.</w:t>
+      </w:r>
+    </w:p>
+    <w:p>
+      <w:pPr>
+        <w:pStyle w:val="Caption"/>
+        <w:keepNext/>
+      </w:pPr>
+      <w:r>
+        <w:t>Screenshot 9  Customer repository Download ZIP</w:t>
+      </w:r>
+    </w:p>
+    <w:tbl>
+      <w:tblPr>
+        <w:tblW w:type="auto" w:w="0"/>
+        <w:tblLayout w:type="fixed"/>
+        <w:tblLook w:firstColumn="1" w:firstRow="1" w:lastColumn="0" w:lastRow="0" w:noHBand="0" w:noVBand="1" w:val="04A0"/>
+      </w:tblPr>
+      <w:tblGrid>
+        <w:gridCol w:w="9533"/>
+      </w:tblGrid>
+      <w:tr>
+        <w:trPr>
+          <w:trHeight w:val="1325" w:hRule="atLeast"/>
+          <w:cantSplit/>
+        </w:trPr>
+        <w:tc>
+          <w:tcPr>
+            <w:tcW w:type="dxa" w:w="9519"/>
+            <w:tcBorders>
+              <w:top w:val="dashed" w:sz="5" w:color="AEB8C3"/>
+              <w:left w:val="dashed" w:sz="5" w:color="AEB8C3"/>
+              <w:bottom w:val="dashed" w:sz="5" w:color="AEB8C3"/>
+              <w:right w:val="dashed" w:sz="5" w:color="AEB8C3"/>
+            </w:tcBorders>
+            <w:tcMar>
+              <w:top w:w="100" w:type="dxa"/>
+              <w:start w:w="160" w:type="dxa"/>
+              <w:bottom w:w="100" w:type="dxa"/>
+              <w:end w:w="160" w:type="dxa"/>
+            </w:tcMar>
+            <w:vAlign w:val="center"/>
+          </w:tcPr>
+          <w:p>
+            <w:pPr>
+              <w:jc w:val="center"/>
+            </w:pPr>
+            <w:r>
+              <w:rPr>
+                <w:b/>
+                <w:color w:val="5A626C"/>
+                <w:sz w:val="18"/>
+              </w:rPr>
+              <w:t>PLACE SCREENSHOT HERE</w:t>
+            </w:r>
+          </w:p>
+          <w:p>
+            <w:pPr>
+              <w:jc w:val="center"/>
+            </w:pPr>
+            <w:r>
+              <w:rPr>
+                <w:color w:val="5A626C"/>
+                <w:sz w:val="17"/>
+              </w:rPr>
+              <w:t>Capture the customer Code menu with Download ZIP visible; hide private repository details if needed.</w:t>
+            </w:r>
+          </w:p>
+        </w:tc>
+      </w:tr>
+    </w:tbl>
+    <w:p>
+      <w:pPr>
+        <w:spacing w:after="40"/>
+      </w:pPr>
+    </w:p>
+    <w:p>
+      <w:pPr>
+        <w:ind w:left="259" w:hanging="259"/>
+      </w:pPr>
+      <w:r>
+        <w:rPr>
+          <w:b/>
+        </w:rPr>
+        <w:t xml:space="preserve">3. </w:t>
+      </w:r>
+      <w:r>
+        <w:rPr>
+          <w:b/>
+        </w:rPr>
+        <w:t xml:space="preserve">Open the target Databricks volume. </w:t>
+      </w:r>
+      <w:r>
+        <w:t>In the Databricks workspace, select Catalog, then the target catalog, schema, and volume. Open the intended folder. If needed, use Create directory on the volume overview before uploading.</w:t>
+      </w:r>
+    </w:p>
+    <w:p>
+      <w:pPr>
+        <w:ind w:left="259" w:hanging="259"/>
+      </w:pPr>
+      <w:r>
+        <w:rPr>
+          <w:b/>
+        </w:rPr>
+        <w:t xml:space="preserve">4. </w:t>
+      </w:r>
+      <w:r>
+        <w:rPr>
+          <w:b/>
+        </w:rPr>
+        <w:t xml:space="preserve">Upload the ZIP to the volume. </w:t>
+      </w:r>
+      <w:r>
+        <w:t>On the volume page, select Upload to this volume. In the Upload files dialog, choose browse or drag the ZIP into Files. Under Destination volume, select the exact volume directory or paste /Volumes/&lt;catalog&gt;/&lt;schema&gt;/&lt;volume&gt;/&lt;folder&gt;/. Complete the upload and wait for it to finish.</w:t>
+      </w:r>
+    </w:p>
+    <w:p>
+      <w:pPr>
+        <w:pStyle w:val="Caption"/>
+        <w:keepNext/>
+      </w:pPr>
+      <w:r>
+        <w:t>Screenshot 10  Databricks Upload files dialog</w:t>
+      </w:r>
+    </w:p>
+    <w:tbl>
+      <w:tblPr>
+        <w:tblW w:type="auto" w:w="0"/>
+        <w:tblLayout w:type="fixed"/>
+        <w:tblLook w:firstColumn="1" w:firstRow="1" w:lastColumn="0" w:lastRow="0" w:noHBand="0" w:noVBand="1" w:val="04A0"/>
+      </w:tblPr>
+      <w:tblGrid>
+        <w:gridCol w:w="9533"/>
+      </w:tblGrid>
+      <w:tr>
+        <w:trPr>
+          <w:trHeight w:val="1325" w:hRule="atLeast"/>
+          <w:cantSplit/>
+        </w:trPr>
+        <w:tc>
+          <w:tcPr>
+            <w:tcW w:type="dxa" w:w="9519"/>
+            <w:tcBorders>
+              <w:top w:val="dashed" w:sz="5" w:color="AEB8C3"/>
+              <w:left w:val="dashed" w:sz="5" w:color="AEB8C3"/>
+              <w:bottom w:val="dashed" w:sz="5" w:color="AEB8C3"/>
+              <w:right w:val="dashed" w:sz="5" w:color="AEB8C3"/>
+            </w:tcBorders>
+            <w:tcMar>
+              <w:top w:w="100" w:type="dxa"/>
+              <w:start w:w="160" w:type="dxa"/>
+              <w:bottom w:w="100" w:type="dxa"/>
+              <w:end w:w="160" w:type="dxa"/>
+            </w:tcMar>
+            <w:vAlign w:val="center"/>
+          </w:tcPr>
+          <w:p>
+            <w:pPr>
+              <w:jc w:val="center"/>
+            </w:pPr>
+            <w:r>
+              <w:rPr>
+                <w:b/>
+                <w:color w:val="5A626C"/>
+                <w:sz w:val="18"/>
+              </w:rPr>
+              <w:t>PLACE SCREENSHOT HERE</w:t>
+            </w:r>
+          </w:p>
+          <w:p>
+            <w:pPr>
+              <w:jc w:val="center"/>
+            </w:pPr>
+            <w:r>
+              <w:rPr>
+                <w:color w:val="5A626C"/>
+                <w:sz w:val="17"/>
+              </w:rPr>
+              <w:t>Capture the ZIP selected under Files and the destination directory, with no credentials visible.</w:t>
+            </w:r>
+          </w:p>
+        </w:tc>
+      </w:tr>
+    </w:tbl>
+    <w:p>
+      <w:pPr>
+        <w:spacing w:after="40"/>
+      </w:pPr>
+    </w:p>
+    <w:p>
+      <w:pPr>
+        <w:ind w:left="259" w:hanging="259"/>
+      </w:pPr>
+      <w:r>
+        <w:rPr>
+          <w:b/>
+        </w:rPr>
+        <w:t xml:space="preserve">5. </w:t>
+      </w:r>
+      <w:r>
+        <w:rPr>
+          <w:b/>
+        </w:rPr>
+        <w:t xml:space="preserve">Verify the uploaded archive. </w:t>
+      </w:r>
+      <w:r>
+        <w:t>Return to the same volume directory and find the ZIP in the file listing. Confirm its name and nonzero size. Record the source commit ID and destination path with the handoff notes.</w:t>
+      </w:r>
+    </w:p>
+    <w:p>
+      <w:pPr>
+        <w:pStyle w:val="Caption"/>
+        <w:keepNext/>
+      </w:pPr>
+      <w:r>
+        <w:t>Screenshot 11  Manual ZIP in the volume</w:t>
+      </w:r>
+    </w:p>
+    <w:tbl>
+      <w:tblPr>
+        <w:tblW w:type="auto" w:w="0"/>
+        <w:tblLayout w:type="fixed"/>
+        <w:tblLook w:firstColumn="1" w:firstRow="1" w:lastColumn="0" w:lastRow="0" w:noHBand="0" w:noVBand="1" w:val="04A0"/>
+      </w:tblPr>
+      <w:tblGrid>
+        <w:gridCol w:w="9533"/>
+      </w:tblGrid>
+      <w:tr>
+        <w:trPr>
+          <w:trHeight w:val="1325" w:hRule="atLeast"/>
+          <w:cantSplit/>
+        </w:trPr>
+        <w:tc>
+          <w:tcPr>
+            <w:tcW w:type="dxa" w:w="9519"/>
+            <w:tcBorders>
+              <w:top w:val="dashed" w:sz="5" w:color="AEB8C3"/>
+              <w:left w:val="dashed" w:sz="5" w:color="AEB8C3"/>
+              <w:bottom w:val="dashed" w:sz="5" w:color="AEB8C3"/>
+              <w:right w:val="dashed" w:sz="5" w:color="AEB8C3"/>
+            </w:tcBorders>
+            <w:tcMar>
+              <w:top w:w="100" w:type="dxa"/>
+              <w:start w:w="160" w:type="dxa"/>
+              <w:bottom w:w="100" w:type="dxa"/>
+              <w:end w:w="160" w:type="dxa"/>
+            </w:tcMar>
+            <w:vAlign w:val="center"/>
+          </w:tcPr>
+          <w:p>
+            <w:pPr>
+              <w:jc w:val="center"/>
+            </w:pPr>
+            <w:r>
+              <w:rPr>
+                <w:b/>
+                <w:color w:val="5A626C"/>
+                <w:sz w:val="18"/>
+              </w:rPr>
+              <w:t>PLACE SCREENSHOT HERE</w:t>
+            </w:r>
+          </w:p>
+          <w:p>
+            <w:pPr>
+              <w:jc w:val="center"/>
+            </w:pPr>
+            <w:r>
+              <w:rPr>
+                <w:color w:val="5A626C"/>
+                <w:sz w:val="17"/>
+              </w:rPr>
+              <w:t>Capture the ZIP filename and size in the target volume folder.</w:t>
+            </w:r>
+          </w:p>
+        </w:tc>
+      </w:tr>
+    </w:tbl>
+    <w:p>
+      <w:pPr>
+        <w:spacing w:after="40"/>
+      </w:pPr>
+    </w:p>
+    <w:p>
+      <w:r>
+        <w:rPr>
+          <w:b/>
+        </w:rPr>
+        <w:t xml:space="preserve">Destination type  </w:t>
+      </w:r>
+      <w:r>
+        <w:t>Upload the ZIP as a file in a Unity Catalog volume. Creating a Unity Catalog table is a separate operation and is not part of this procedure.</w:t>
+      </w:r>
     </w:p>
     <w:p>
       <w:pPr>
@@ -3232,7 +3589,7 @@
         <w:pStyle w:val="ListBullet"/>
       </w:pPr>
       <w:r>
-        <w:t>Successful example: GitHub run 37748667012 completed on 8 October 2026. The uploaded ZIP was verified in the volume as an 83,286-byte file. This is a historical check; use the current run summary for later uploads.</w:t>
+        <w:t>Reference implementation test only: GitHub run 37748667012 in UnravelCICD completed on 8 October 2026. The uploaded ZIP was verified in the volume as an 83,286-byte file. This does not verify a customer installation; use the customer run summary and target volume listing for their upload.</w:t>
       </w:r>
     </w:p>
     <w:p>
@@ -3264,7 +3621,7 @@
         <w:rPr>
           <w:b w:val="0"/>
         </w:rPr>
-        <w:t xml:space="preserve">Copy this file to </w:t>
+        <w:t xml:space="preserve">Copy this file to the customer repository at </w:t>
       </w:r>
       <w:r>
         <w:rPr>
@@ -3477,7 +3834,7 @@
             <w:color w:val="1F4E79"/>
             <w:u w:val="single"/>
           </w:rPr>
-          <w:t>Azure Databricks personal access tokens</w:t>
+          <w:t>GitHub downloading a repository source ZIP</w:t>
         </w:r>
       </w:hyperlink>
     </w:p>
@@ -3494,7 +3851,7 @@
             <w:color w:val="1F4E79"/>
             <w:u w:val="single"/>
           </w:rPr>
-          <w:t>Azure Databricks volume paths and Catalog Explorer</w:t>
+          <w:t>Azure Databricks personal access tokens</w:t>
         </w:r>
       </w:hyperlink>
     </w:p>
@@ -3511,7 +3868,7 @@
             <w:color w:val="1F4E79"/>
             <w:u w:val="single"/>
           </w:rPr>
-          <w:t>Azure Databricks volume privileges</w:t>
+          <w:t>Azure Databricks volume paths and Catalog Explorer</w:t>
         </w:r>
       </w:hyperlink>
     </w:p>
@@ -3528,12 +3885,46 @@
             <w:color w:val="1F4E79"/>
             <w:u w:val="single"/>
           </w:rPr>
+          <w:t>Azure Databricks volume privileges</w:t>
+        </w:r>
+      </w:hyperlink>
+    </w:p>
+    <w:p>
+      <w:pPr>
+        <w:spacing w:after="40"/>
+      </w:pPr>
+      <w:r>
+        <w:t xml:space="preserve">9. </w:t>
+      </w:r>
+      <w:hyperlink r:id="rId20">
+        <w:r>
+          <w:rPr>
+            <w:color w:val="1F4E79"/>
+            <w:u w:val="single"/>
+          </w:rPr>
           <w:t>Azure Databricks CLI fs commands</w:t>
         </w:r>
       </w:hyperlink>
     </w:p>
+    <w:p>
+      <w:pPr>
+        <w:spacing w:after="40"/>
+      </w:pPr>
+      <w:r>
+        <w:t xml:space="preserve">10. </w:t>
+      </w:r>
+      <w:hyperlink r:id="rId21">
+        <w:r>
+          <w:rPr>
+            <w:color w:val="1F4E79"/>
+            <w:u w:val="single"/>
+          </w:rPr>
+          <w:t>Azure Databricks upload files to a volume</w:t>
+        </w:r>
+      </w:hyperlink>
+    </w:p>
     <w:sectPr>
-      <w:footerReference w:type="default" r:id="rId20"/>
+      <w:footerReference w:type="default" r:id="rId22"/>
       <w:pgSz w:w="11909" w:h="16834"/>
       <w:pgMar w:top="1037" w:right="1195" w:bottom="1037" w:left="1195" w:header="720" w:footer="720" w:gutter="0"/>
       <w:cols w:space="720"/>

</xml_diff>

<commit_message>
docs: make integration guide customer facing
</commit_message>
<xml_diff>
--- a/docs/Unravel_Github_Integration_Setup_Guide.docx
+++ b/docs/Unravel_Github_Integration_Setup_Guide.docx
@@ -8,7 +8,7 @@
         <w:keepNext/>
       </w:pPr>
       <w:r>
-        <w:t>Unravel Github Integration Setup and Operations Guide</w:t>
+        <w:t>Unravel Github Integration Setup Guide</w:t>
       </w:r>
     </w:p>
     <w:p>
@@ -16,7 +16,7 @@
         <w:pStyle w:val="Subtitle"/>
       </w:pPr>
       <w:r>
-        <w:t>Customer setup, manual workflow runs, and browser upload alternative</w:t>
+        <w:t>Install the supplied workflow and upload your repository ZIP to a Unity Catalog volume</w:t>
       </w:r>
     </w:p>
     <w:p>
@@ -27,7 +27,7 @@
         <w:t xml:space="preserve">Purpose  </w:t>
       </w:r>
       <w:r>
-        <w:t>Use this guide to install the Unravel Github Integration workflow in a customer GitHub repository, configure it, run it on demand, and verify the uploaded ZIP in a Unity Catalog volume. If GitHub Actions cannot be used, follow Section 6 to download the repository ZIP and upload it through the Databricks browser interface.</w:t>
+        <w:t>Follow this guide to add the supplied Unravel Github Integration workflow file to your GitHub repository, set its secrets, run it from the Actions tab, and verify the ZIP in a Unity Catalog volume. If GitHub Actions cannot be used, follow Section 6 to download your repository ZIP and upload it through the Databricks browser interface.</w:t>
       </w:r>
     </w:p>
     <w:p>
@@ -35,10 +35,10 @@
         <w:rPr>
           <w:b/>
         </w:rPr>
-        <w:t xml:space="preserve">Deployment scope  </w:t>
+        <w:t xml:space="preserve">What we provide  </w:t>
       </w:r>
       <w:r>
-        <w:t>UnravelCICD is the tested reference repository. Its workflow and GitHub secrets are not installed in the customer repository. Each customer must add the YAML file to their own repository and create the three secrets there before the Actions route can run. The manual browser route needs no workflow or GitHub Actions secrets.</w:t>
+        <w:t>We provide upload-repo-zip-to-databricks.yml. Add that file to your repository at .github/workflows/upload-repo-zip-to-databricks.yml. Its complete contents are reproduced in Appendix A. You create the three GitHub Actions secrets in your repository. The browser upload route needs no workflow or GitHub Actions secrets.</w:t>
       </w:r>
     </w:p>
     <w:p>
@@ -46,19 +46,10 @@
         <w:rPr>
           <w:b/>
         </w:rPr>
-        <w:t xml:space="preserve">Reference repository  </w:t>
+        <w:t xml:space="preserve">Workflow name in Actions  </w:t>
       </w:r>
-      <w:hyperlink r:id="rId9">
-        <w:r>
-          <w:rPr>
-            <w:color w:val="1F4E79"/>
-            <w:u w:val="single"/>
-          </w:rPr>
-          <w:t>chandusanith-unravel/UnravelCICD</w:t>
-        </w:r>
-      </w:hyperlink>
       <w:r>
-        <w:t xml:space="preserve">    Workflow shown in Actions  Unravel Github Integration</w:t>
+        <w:t>Unravel Github Integration</w:t>
       </w:r>
     </w:p>
     <w:p>
@@ -81,6 +72,10 @@
         <w:gridCol w:w="3629"/>
       </w:tblGrid>
       <w:tr>
+        <w:trPr>
+          <w:cantSplit/>
+          <w:tblHeader/>
+        </w:trPr>
         <w:tc>
           <w:tcPr>
             <w:tcW w:type="dxa" w:w="3173"/>
@@ -167,6 +162,9 @@
         </w:tc>
       </w:tr>
       <w:tr>
+        <w:trPr>
+          <w:cantSplit/>
+        </w:trPr>
         <w:tc>
           <w:tcPr>
             <w:tcW w:type="dxa" w:w="1800"/>
@@ -221,7 +219,7 @@
               <w:rPr>
                 <w:sz w:val="17"/>
               </w:rPr>
-              <w:t>Customer repository: .github/workflows/upload-repo-zip-to-databricks.yml</w:t>
+              <w:t>Your repository: .github/workflows/upload-repo-zip-to-databricks.yml</w:t>
             </w:r>
           </w:p>
         </w:tc>
@@ -256,6 +254,9 @@
         </w:tc>
       </w:tr>
       <w:tr>
+        <w:trPr>
+          <w:cantSplit/>
+        </w:trPr>
         <w:tc>
           <w:tcPr>
             <w:tcW w:type="dxa" w:w="1800"/>
@@ -348,6 +349,9 @@
         </w:tc>
       </w:tr>
       <w:tr>
+        <w:trPr>
+          <w:cantSplit/>
+        </w:trPr>
         <w:tc>
           <w:tcPr>
             <w:tcW w:type="dxa" w:w="1800"/>
@@ -402,7 +406,7 @@
               <w:rPr>
                 <w:sz w:val="17"/>
               </w:rPr>
-              <w:t>Customer repository Settings &gt; Secrets and variables &gt; Actions</w:t>
+              <w:t>Your repository Settings &gt; Secrets and variables &gt; Actions</w:t>
             </w:r>
           </w:p>
         </w:tc>
@@ -437,6 +441,9 @@
         </w:tc>
       </w:tr>
       <w:tr>
+        <w:trPr>
+          <w:cantSplit/>
+        </w:trPr>
         <w:tc>
           <w:tcPr>
             <w:tcW w:type="dxa" w:w="1800"/>
@@ -547,7 +554,7 @@
         <w:pStyle w:val="ListBullet"/>
       </w:pPr>
       <w:r>
-        <w:t>GitHub Actions route: you need access to the customer repository, permission to add the YAML and create repository secrets, and write access to start the workflow. If the default branch is protected, merge the file through a pull request.</w:t>
+        <w:t>GitHub Actions route: you need permission to add the YAML and create repository secrets in your GitHub repository, and write access to start the workflow. If the default branch is protected, merge the file through a pull request.</w:t>
       </w:r>
     </w:p>
     <w:p>
@@ -555,7 +562,7 @@
         <w:pStyle w:val="ListBullet"/>
       </w:pPr>
       <w:r>
-        <w:t>Browser route: you need access to download the customer repository ZIP and permission to upload to the destination Databricks volume. Sections 1.1 and 1.3 and all GitHub Actions secrets are unnecessary for this route.</w:t>
+        <w:t>Browser route: you need access to download your repository ZIP and permission to upload to the destination Databricks volume. Sections 1.1 and 1.3 and all GitHub Actions secrets are unnecessary for this route.</w:t>
       </w:r>
     </w:p>
     <w:p>
@@ -1058,7 +1065,7 @@
         <w:pStyle w:val="Heading1"/>
       </w:pPr>
       <w:r>
-        <w:t>2 Install the workflow in the customer repository</w:t>
+        <w:t>2 Add the supplied workflow file to your repository</w:t>
       </w:r>
     </w:p>
     <w:p>
@@ -1066,22 +1073,11 @@
         <w:rPr>
           <w:b/>
         </w:rPr>
-        <w:t xml:space="preserve">Do this in each customer repository. </w:t>
+        <w:t xml:space="preserve">File to add  </w:t>
       </w:r>
       <w:r>
-        <w:t>The reference repository already contains the file, but its installation does not apply to customer repositories. Add one YAML file at .github/workflows/upload-repo-zip-to-databricks.yml in the customer repository. The complete YAML appears in Appendix A and is also available in the linked reference file.</w:t>
+        <w:t>upload-repo-zip-to-databricks.yml, supplied with this guide. Put it at .github/workflows/upload-repo-zip-to-databricks.yml in your repository. The complete contents are also printed in Appendix A. GitHub discovers workflow files in .github/workflows when their extension is .yml or .yaml.</w:t>
       </w:r>
-    </w:p>
-    <w:p>
-      <w:hyperlink r:id="rId10">
-        <w:r>
-          <w:rPr>
-            <w:color w:val="1F4E79"/>
-            <w:u w:val="single"/>
-          </w:rPr>
-          <w:t>Open the reference workflow YAML</w:t>
-        </w:r>
-      </w:hyperlink>
     </w:p>
     <w:p>
       <w:pPr>
@@ -1097,10 +1093,10 @@
         <w:rPr>
           <w:b/>
         </w:rPr>
-        <w:t xml:space="preserve">Open the customer repository Code tab. </w:t>
+        <w:t xml:space="preserve">Open your repository Code tab. </w:t>
       </w:r>
       <w:r>
-        <w:t>Choose the branch where the file will be committed. For the manual Run workflow button to appear, the workflow must be present on the customer repository default branch.</w:t>
+        <w:t>Choose the branch where the file will be committed. For the manual Run workflow button to appear, the workflow must be present on your repository default branch.</w:t>
       </w:r>
     </w:p>
     <w:p>
@@ -1137,10 +1133,10 @@
         <w:rPr>
           <w:b/>
         </w:rPr>
-        <w:t xml:space="preserve">Paste Appendix A without changes to indentation. </w:t>
+        <w:t xml:space="preserve">Copy the supplied YAML into the new file. </w:t>
       </w:r>
       <w:r>
-        <w:t>YAML spacing matters. Keep the on: workflow_dispatch trigger and the three secret references. No separate Python, Bash, or Databricks script is required.</w:t>
+        <w:t>Open upload-repo-zip-to-databricks.yml in a text editor and copy all its contents, or copy Appendix A. Keep the indentation, on: workflow_dispatch trigger, and three secret references exactly as shown. No separate Python, Bash, or Databricks script is required.</w:t>
       </w:r>
     </w:p>
     <w:p>
@@ -1157,10 +1153,10 @@
         <w:rPr>
           <w:b/>
         </w:rPr>
-        <w:t xml:space="preserve">Commit the file in the customer repository. </w:t>
+        <w:t xml:space="preserve">Commit the file. </w:t>
       </w:r>
       <w:r>
-        <w:t>Select Commit changes. Commit to the default branch if allowed, or open and merge a pull request. Verify the exact path above on the default branch and check that Unravel Github Integration appears in its Actions tab.</w:t>
+        <w:t>Select Commit changes. Commit to your default branch if allowed, or open and merge a pull request. Verify the exact path above on the default branch and check that Unravel Github Integration appears in your Actions tab.</w:t>
       </w:r>
     </w:p>
     <w:p>
@@ -1169,7 +1165,7 @@
         <w:keepNext/>
       </w:pPr>
       <w:r>
-        <w:t>Screenshot 4  Workflow file in the customer repository</w:t>
+        <w:t>Screenshot 4  Workflow file in your repository</w:t>
       </w:r>
     </w:p>
     <w:tbl>
@@ -1225,7 +1221,7 @@
                 <w:color w:val="5A626C"/>
                 <w:sz w:val="17"/>
               </w:rPr>
-              <w:t>Capture the customer Code tab with the .github/workflows path and YAML filename visible.</w:t>
+              <w:t>Capture your Code tab with the .github/workflows path and YAML filename visible.</w:t>
             </w:r>
           </w:p>
         </w:tc>
@@ -1258,10 +1254,10 @@
         <w:rPr>
           <w:b/>
         </w:rPr>
-        <w:t xml:space="preserve">Open the customer repository settings. </w:t>
+        <w:t xml:space="preserve">Open your repository settings. </w:t>
       </w:r>
       <w:r>
-        <w:t>On the customer GitHub repository page, select Settings. In the left sidebar under Security, select Secrets and variables &gt; Actions, then the Secrets tab.</w:t>
+        <w:t>On your GitHub repository page, select Settings. In the left sidebar under Security, select Secrets and variables &gt; Actions, then the Secrets tab.</w:t>
       </w:r>
     </w:p>
     <w:p>
@@ -1296,6 +1292,10 @@
         <w:gridCol w:w="3586"/>
       </w:tblGrid>
       <w:tr>
+        <w:trPr>
+          <w:cantSplit/>
+          <w:tblHeader/>
+        </w:trPr>
         <w:tc>
           <w:tcPr>
             <w:tcW w:type="dxa" w:w="3173"/>
@@ -1382,6 +1382,9 @@
         </w:tc>
       </w:tr>
       <w:tr>
+        <w:trPr>
+          <w:cantSplit/>
+        </w:trPr>
         <w:tc>
           <w:tcPr>
             <w:tcW w:type="dxa" w:w="2045"/>
@@ -1471,6 +1474,9 @@
         </w:tc>
       </w:tr>
       <w:tr>
+        <w:trPr>
+          <w:cantSplit/>
+        </w:trPr>
         <w:tc>
           <w:tcPr>
             <w:tcW w:type="dxa" w:w="2045"/>
@@ -1563,6 +1569,9 @@
         </w:tc>
       </w:tr>
       <w:tr>
+        <w:trPr>
+          <w:cantSplit/>
+        </w:trPr>
         <w:tc>
           <w:tcPr>
             <w:tcW w:type="dxa" w:w="2045"/>
@@ -1674,7 +1683,7 @@
         <w:t xml:space="preserve">Confirm the names, not the values. </w:t>
       </w:r>
       <w:r>
-        <w:t>The customer repository Secrets page must list DBX_URL, DBX_TOKEN, and DBX_VOLUME_PATH. Secrets created in UnravelCICD do not carry over. GitHub does not display stored values again; to change one, update that secret. These are repository secrets, not Actions variables.</w:t>
+        <w:t>Your repository Secrets page must list DBX_URL, DBX_TOKEN, and DBX_VOLUME_PATH. GitHub does not display stored values again; to change one, update that secret. These are repository secrets, not Actions variables.</w:t>
       </w:r>
     </w:p>
     <w:p>
@@ -1772,10 +1781,10 @@
         <w:rPr>
           <w:b/>
         </w:rPr>
-        <w:t xml:space="preserve">Open customer Actions. </w:t>
+        <w:t xml:space="preserve">Open Actions. </w:t>
       </w:r>
       <w:r>
-        <w:t>In the customer repository, select the Actions tab, then choose Unravel Github Integration in the left workflow list.</w:t>
+        <w:t>In your repository, select the Actions tab, then choose Unravel Github Integration in the left workflow list.</w:t>
       </w:r>
     </w:p>
     <w:p>
@@ -1795,7 +1804,7 @@
         <w:t xml:space="preserve">Start a run. </w:t>
       </w:r>
       <w:r>
-        <w:t>Select Run workflow, choose the branch to archive (normally main), and select the green Run workflow button. This workflow has no manual input fields because it reads the three repository secrets.</w:t>
+        <w:t>Select Run workflow, choose the branch to archive (usually your default branch), and select the green Run workflow button. This workflow has no manual input fields because it reads the three repository secrets.</w:t>
       </w:r>
     </w:p>
     <w:p>
@@ -2141,7 +2150,7 @@
         <w:t xml:space="preserve">Use this route when the workflow cannot be installed or run. </w:t>
       </w:r>
       <w:r>
-        <w:t>It needs no GitHub Actions workflow, PAT, or repository secrets. You need read access to the customer repository and USE CATALOG, USE SCHEMA, and WRITE VOLUME for the Databricks destination. The volume must already exist. The browser upload limit is 5 GB per file. Repeat these steps whenever a newer repository snapshot is needed.</w:t>
+        <w:t>It needs no GitHub Actions workflow, PAT, or repository secrets. You need read access to your repository and USE CATALOG, USE SCHEMA, and WRITE VOLUME for the Databricks destination. The volume must already exist. The browser upload limit is 5 GB per file. Repeat these steps whenever a newer repository snapshot is needed.</w:t>
       </w:r>
     </w:p>
     <w:p>
@@ -2161,7 +2170,7 @@
         <w:t xml:space="preserve">Choose the source version in GitHub. </w:t>
       </w:r>
       <w:r>
-        <w:t>Open the customer repository Code tab and use the branch or tag selector to show the version you want. Record its branch or tag and commit ID for traceability.</w:t>
+        <w:t>Open your repository Code tab and use the branch or tag selector to show the version you want. Record its branch or tag and commit ID for traceability.</w:t>
       </w:r>
     </w:p>
     <w:p>
@@ -2190,7 +2199,7 @@
         <w:keepNext/>
       </w:pPr>
       <w:r>
-        <w:t>Screenshot 9  Customer repository Download ZIP</w:t>
+        <w:t>Screenshot 9  Download ZIP from your repository</w:t>
       </w:r>
     </w:p>
     <w:tbl>
@@ -2246,7 +2255,7 @@
                 <w:color w:val="5A626C"/>
                 <w:sz w:val="17"/>
               </w:rPr>
-              <w:t>Capture the customer Code menu with Download ZIP visible; hide private repository details if needed.</w:t>
+              <w:t>Capture your Code menu with Download ZIP visible; hide private repository details if needed.</w:t>
             </w:r>
           </w:p>
         </w:tc>
@@ -2493,6 +2502,10 @@
         <w:gridCol w:w="6624"/>
       </w:tblGrid>
       <w:tr>
+        <w:trPr>
+          <w:cantSplit/>
+          <w:tblHeader/>
+        </w:trPr>
         <w:tc>
           <w:tcPr>
             <w:tcW w:type="dxa" w:w="4759"/>
@@ -2551,6 +2564,9 @@
         </w:tc>
       </w:tr>
       <w:tr>
+        <w:trPr>
+          <w:cantSplit/>
+        </w:trPr>
         <w:tc>
           <w:tcPr>
             <w:tcW w:type="dxa" w:w="2909"/>
@@ -2611,6 +2627,9 @@
         </w:tc>
       </w:tr>
       <w:tr>
+        <w:trPr>
+          <w:cantSplit/>
+        </w:trPr>
         <w:tc>
           <w:tcPr>
             <w:tcW w:type="dxa" w:w="2909"/>
@@ -2673,6 +2692,9 @@
         </w:tc>
       </w:tr>
       <w:tr>
+        <w:trPr>
+          <w:cantSplit/>
+        </w:trPr>
         <w:tc>
           <w:tcPr>
             <w:tcW w:type="dxa" w:w="2909"/>
@@ -2733,6 +2755,9 @@
         </w:tc>
       </w:tr>
       <w:tr>
+        <w:trPr>
+          <w:cantSplit/>
+        </w:trPr>
         <w:tc>
           <w:tcPr>
             <w:tcW w:type="dxa" w:w="2909"/>
@@ -2795,6 +2820,9 @@
         </w:tc>
       </w:tr>
       <w:tr>
+        <w:trPr>
+          <w:cantSplit/>
+        </w:trPr>
         <w:tc>
           <w:tcPr>
             <w:tcW w:type="dxa" w:w="2909"/>
@@ -2855,6 +2883,9 @@
         </w:tc>
       </w:tr>
       <w:tr>
+        <w:trPr>
+          <w:cantSplit/>
+        </w:trPr>
         <w:tc>
           <w:tcPr>
             <w:tcW w:type="dxa" w:w="2909"/>
@@ -2917,6 +2948,9 @@
         </w:tc>
       </w:tr>
       <w:tr>
+        <w:trPr>
+          <w:cantSplit/>
+        </w:trPr>
         <w:tc>
           <w:tcPr>
             <w:tcW w:type="dxa" w:w="2909"/>
@@ -3001,6 +3035,10 @@
         <w:gridCol w:w="6451"/>
       </w:tblGrid>
       <w:tr>
+        <w:trPr>
+          <w:cantSplit/>
+          <w:tblHeader/>
+        </w:trPr>
         <w:tc>
           <w:tcPr>
             <w:tcW w:type="dxa" w:w="4759"/>
@@ -3059,6 +3097,9 @@
         </w:tc>
       </w:tr>
       <w:tr>
+        <w:trPr>
+          <w:cantSplit/>
+        </w:trPr>
         <w:tc>
           <w:tcPr>
             <w:tcW w:type="dxa" w:w="3082"/>
@@ -3119,6 +3160,9 @@
         </w:tc>
       </w:tr>
       <w:tr>
+        <w:trPr>
+          <w:cantSplit/>
+        </w:trPr>
         <w:tc>
           <w:tcPr>
             <w:tcW w:type="dxa" w:w="3082"/>
@@ -3181,6 +3225,9 @@
         </w:tc>
       </w:tr>
       <w:tr>
+        <w:trPr>
+          <w:cantSplit/>
+        </w:trPr>
         <w:tc>
           <w:tcPr>
             <w:tcW w:type="dxa" w:w="3082"/>
@@ -3241,6 +3288,9 @@
         </w:tc>
       </w:tr>
       <w:tr>
+        <w:trPr>
+          <w:cantSplit/>
+        </w:trPr>
         <w:tc>
           <w:tcPr>
             <w:tcW w:type="dxa" w:w="3082"/>
@@ -3303,6 +3353,9 @@
         </w:tc>
       </w:tr>
       <w:tr>
+        <w:trPr>
+          <w:cantSplit/>
+        </w:trPr>
         <w:tc>
           <w:tcPr>
             <w:tcW w:type="dxa" w:w="3082"/>
@@ -3363,6 +3416,9 @@
         </w:tc>
       </w:tr>
       <w:tr>
+        <w:trPr>
+          <w:cantSplit/>
+        </w:trPr>
         <w:tc>
           <w:tcPr>
             <w:tcW w:type="dxa" w:w="3082"/>
@@ -3425,6 +3481,9 @@
         </w:tc>
       </w:tr>
       <w:tr>
+        <w:trPr>
+          <w:cantSplit/>
+        </w:trPr>
         <w:tc>
           <w:tcPr>
             <w:tcW w:type="dxa" w:w="3082"/>
@@ -3485,6 +3544,9 @@
         </w:tc>
       </w:tr>
       <w:tr>
+        <w:trPr>
+          <w:cantSplit/>
+        </w:trPr>
         <w:tc>
           <w:tcPr>
             <w:tcW w:type="dxa" w:w="3082"/>
@@ -3557,7 +3619,7 @@
         <w:pStyle w:val="Heading1"/>
       </w:pPr>
       <w:r>
-        <w:t>Maintenance and tested example</w:t>
+        <w:t>Maintenance and handoff checks</w:t>
       </w:r>
     </w:p>
     <w:p>
@@ -3589,19 +3651,8 @@
         <w:pStyle w:val="ListBullet"/>
       </w:pPr>
       <w:r>
-        <w:t>Reference implementation test only: GitHub run 37748667012 in UnravelCICD completed on 8 October 2026. The uploaded ZIP was verified in the volume as an 83,286-byte file. This does not verify a customer installation; use the customer run summary and target volume listing for their upload.</w:t>
+        <w:t>After your first run, record the GitHub run link, selected branch and commit, ZIP filename, and destination volume path. Confirm the ZIP is visible in the target folder before considering setup complete.</w:t>
       </w:r>
-    </w:p>
-    <w:p>
-      <w:hyperlink r:id="rId11">
-        <w:r>
-          <w:rPr>
-            <w:color w:val="1F4E79"/>
-            <w:u w:val="single"/>
-          </w:rPr>
-          <w:t>Open the successful example run</w:t>
-        </w:r>
-      </w:hyperlink>
     </w:p>
     <w:p>
       <w:r>
@@ -3621,7 +3672,7 @@
         <w:rPr>
           <w:b w:val="0"/>
         </w:rPr>
-        <w:t xml:space="preserve">Copy this file to the customer repository at </w:t>
+        <w:t xml:space="preserve">Add the supplied YAML file to your repository at </w:t>
       </w:r>
       <w:r>
         <w:rPr>
@@ -3630,7 +3681,7 @@
         <w:t>.github/workflows/upload-repo-zip-to-databricks.yml</w:t>
       </w:r>
       <w:r>
-        <w:t>. The listing below is a snapshot of the current repository workflow. Keep all indentation, punctuation, and secret names when copying.</w:t>
+        <w:t>. The listing below reproduces the supplied file. Keep all indentation, punctuation, and secret names when copying.</w:t>
       </w:r>
     </w:p>
     <w:p>
@@ -3760,7 +3811,7 @@
       <w:r>
         <w:t xml:space="preserve">1. </w:t>
       </w:r>
-      <w:hyperlink r:id="rId12">
+      <w:hyperlink r:id="rId9">
         <w:r>
           <w:rPr>
             <w:color w:val="1F4E79"/>
@@ -3777,7 +3828,7 @@
       <w:r>
         <w:t xml:space="preserve">2. </w:t>
       </w:r>
-      <w:hyperlink r:id="rId13">
+      <w:hyperlink r:id="rId10">
         <w:r>
           <w:rPr>
             <w:color w:val="1F4E79"/>
@@ -3794,7 +3845,7 @@
       <w:r>
         <w:t xml:space="preserve">3. </w:t>
       </w:r>
-      <w:hyperlink r:id="rId14">
+      <w:hyperlink r:id="rId11">
         <w:r>
           <w:rPr>
             <w:color w:val="1F4E79"/>
@@ -3811,7 +3862,7 @@
       <w:r>
         <w:t xml:space="preserve">4. </w:t>
       </w:r>
-      <w:hyperlink r:id="rId15">
+      <w:hyperlink r:id="rId12">
         <w:r>
           <w:rPr>
             <w:color w:val="1F4E79"/>
@@ -3828,7 +3879,7 @@
       <w:r>
         <w:t xml:space="preserve">5. </w:t>
       </w:r>
-      <w:hyperlink r:id="rId16">
+      <w:hyperlink r:id="rId13">
         <w:r>
           <w:rPr>
             <w:color w:val="1F4E79"/>
@@ -3845,7 +3896,7 @@
       <w:r>
         <w:t xml:space="preserve">6. </w:t>
       </w:r>
-      <w:hyperlink r:id="rId17">
+      <w:hyperlink r:id="rId14">
         <w:r>
           <w:rPr>
             <w:color w:val="1F4E79"/>
@@ -3862,7 +3913,7 @@
       <w:r>
         <w:t xml:space="preserve">7. </w:t>
       </w:r>
-      <w:hyperlink r:id="rId18">
+      <w:hyperlink r:id="rId15">
         <w:r>
           <w:rPr>
             <w:color w:val="1F4E79"/>
@@ -3879,7 +3930,7 @@
       <w:r>
         <w:t xml:space="preserve">8. </w:t>
       </w:r>
-      <w:hyperlink r:id="rId19">
+      <w:hyperlink r:id="rId16">
         <w:r>
           <w:rPr>
             <w:color w:val="1F4E79"/>
@@ -3896,7 +3947,7 @@
       <w:r>
         <w:t xml:space="preserve">9. </w:t>
       </w:r>
-      <w:hyperlink r:id="rId20">
+      <w:hyperlink r:id="rId17">
         <w:r>
           <w:rPr>
             <w:color w:val="1F4E79"/>
@@ -3913,7 +3964,7 @@
       <w:r>
         <w:t xml:space="preserve">10. </w:t>
       </w:r>
-      <w:hyperlink r:id="rId21">
+      <w:hyperlink r:id="rId18">
         <w:r>
           <w:rPr>
             <w:color w:val="1F4E79"/>
@@ -3924,7 +3975,7 @@
       </w:hyperlink>
     </w:p>
     <w:sectPr>
-      <w:footerReference w:type="default" r:id="rId22"/>
+      <w:footerReference w:type="default" r:id="rId19"/>
       <w:pgSz w:w="11909" w:h="16834"/>
       <w:pgMar w:top="1037" w:right="1195" w:bottom="1037" w:left="1195" w:header="720" w:footer="720" w:gutter="0"/>
       <w:cols w:space="720"/>

</xml_diff>

<commit_message>
docs: add CLI verification for manual volume upload
</commit_message>
<xml_diff>
--- a/docs/Unravel_Github_Integration_Setup_Guide.docx
+++ b/docs/Unravel_Github_Integration_Setup_Guide.docx
@@ -2150,7 +2150,7 @@
         <w:t xml:space="preserve">Use this route when the workflow cannot be installed or run. </w:t>
       </w:r>
       <w:r>
-        <w:t>It needs no GitHub Actions workflow, PAT, or repository secrets. You need read access to your repository and USE CATALOG, USE SCHEMA, and WRITE VOLUME for the Databricks destination. The volume must already exist. The browser upload limit is 5 GB per file. Repeat these steps whenever a newer repository snapshot is needed.</w:t>
+        <w:t>It needs no GitHub Actions workflow, PAT, or repository secrets. You need read access to your repository and USE CATALOG, USE SCHEMA, READ VOLUME, and WRITE VOLUME for the Databricks destination. The volume must already exist. The browser upload limit is 5 GB per file. Repeat these steps whenever a newer repository snapshot is needed.</w:t>
       </w:r>
     </w:p>
     <w:p>
@@ -2393,10 +2393,10 @@
         <w:rPr>
           <w:b/>
         </w:rPr>
-        <w:t xml:space="preserve">Verify the uploaded archive. </w:t>
+        <w:t xml:space="preserve">Verify the uploaded archive in Catalog Explorer. </w:t>
       </w:r>
       <w:r>
-        <w:t>Return to the same volume directory and find the ZIP in the file listing. Confirm its name and nonzero size. Record the source commit ID and destination path with the handoff notes.</w:t>
+        <w:t>After the upload finishes, open Catalog &gt; your catalog &gt; your schema &gt; Volumes &gt; your volume &gt; the selected folder. Find the ZIP with the same filename you downloaded and confirm its size is greater than zero. If it is missing, refresh the listing and check the Destination volume selected in step 4. Use the file menu &gt; Copy path if you need the exact saved location. Record the source branch or tag, commit ID, ZIP filename, and volume path with the handoff notes.</w:t>
       </w:r>
     </w:p>
     <w:p>
@@ -2471,6 +2471,144 @@
       <w:pPr>
         <w:spacing w:after="40"/>
       </w:pPr>
+    </w:p>
+    <w:p>
+      <w:pPr>
+        <w:pStyle w:val="Heading2"/>
+      </w:pPr>
+      <w:r>
+        <w:t>Optional verification with Databricks CLI</w:t>
+      </w:r>
+    </w:p>
+    <w:p>
+      <w:r>
+        <w:rPr>
+          <w:b/>
+        </w:rPr>
+        <w:t xml:space="preserve">Yes, you can verify the manual upload with the Databricks CLI. </w:t>
+      </w:r>
+      <w:r>
+        <w:t>Run these commands on your computer. Use the same workspace and volume as the browser upload. CLI verification uses your own sign-in; it does not require the GitHub Actions token or secrets.</w:t>
+      </w:r>
+    </w:p>
+    <w:p>
+      <w:pPr>
+        <w:ind w:left="259" w:hanging="259"/>
+      </w:pPr>
+      <w:r>
+        <w:rPr>
+          <w:b/>
+        </w:rPr>
+        <w:t xml:space="preserve">1. </w:t>
+      </w:r>
+      <w:r>
+        <w:rPr>
+          <w:b/>
+        </w:rPr>
+        <w:t xml:space="preserve">Check that the Databricks CLI is installed. </w:t>
+      </w:r>
+      <w:r>
+        <w:t>Open Terminal or Command Prompt and run the version command below. If it is unavailable, follow the Databricks CLI installation source at the end of this guide.</w:t>
+      </w:r>
+    </w:p>
+    <w:p>
+      <w:pPr>
+        <w:spacing w:before="20" w:after="100"/>
+        <w:ind w:left="259"/>
+      </w:pPr>
+      <w:r>
+        <w:rPr>
+          <w:rFonts w:ascii="Courier New" w:hAnsi="Courier New"/>
+          <w:sz w:val="17"/>
+        </w:rPr>
+        <w:t>databricks -v</w:t>
+      </w:r>
+    </w:p>
+    <w:p>
+      <w:pPr>
+        <w:ind w:left="259" w:hanging="259"/>
+      </w:pPr>
+      <w:r>
+        <w:rPr>
+          <w:b/>
+        </w:rPr>
+        <w:t xml:space="preserve">2. </w:t>
+      </w:r>
+      <w:r>
+        <w:rPr>
+          <w:b/>
+        </w:rPr>
+        <w:t xml:space="preserve">Sign in to the workspace. </w:t>
+      </w:r>
+      <w:r>
+        <w:t>Replace the placeholder host with your Databricks workspace host. Follow the browser sign-in prompts. The volume-check profile keeps this verification pointed at that workspace.</w:t>
+      </w:r>
+    </w:p>
+    <w:p>
+      <w:pPr>
+        <w:spacing w:before="20" w:after="100"/>
+        <w:ind w:left="259"/>
+      </w:pPr>
+      <w:r>
+        <w:rPr>
+          <w:rFonts w:ascii="Courier New" w:hAnsi="Courier New"/>
+          <w:sz w:val="17"/>
+        </w:rPr>
+        <w:t>databricks auth login --host "https://&lt;workspace-host&gt;" --profile volume-check</w:t>
+      </w:r>
+    </w:p>
+    <w:p>
+      <w:pPr>
+        <w:ind w:left="259" w:hanging="259"/>
+      </w:pPr>
+      <w:r>
+        <w:rPr>
+          <w:b/>
+        </w:rPr>
+        <w:t xml:space="preserve">3. </w:t>
+      </w:r>
+      <w:r>
+        <w:rPr>
+          <w:b/>
+        </w:rPr>
+        <w:t xml:space="preserve">List the destination folder. </w:t>
+      </w:r>
+      <w:r>
+        <w:t>Replace catalog, schema, volume, and optional folder with your actual names. The CLI requires dbfs:/Volumes/... even if Catalog Explorer displays /Volumes/.... Omit /&lt;folder&gt; if the ZIP is at the volume root.</w:t>
+      </w:r>
+    </w:p>
+    <w:p>
+      <w:pPr>
+        <w:spacing w:before="20" w:after="100"/>
+        <w:ind w:left="259"/>
+      </w:pPr>
+      <w:r>
+        <w:rPr>
+          <w:rFonts w:ascii="Courier New" w:hAnsi="Courier New"/>
+          <w:sz w:val="17"/>
+        </w:rPr>
+        <w:t>databricks fs ls "dbfs:/Volumes/&lt;catalog&gt;/&lt;schema&gt;/&lt;volume&gt;/&lt;folder&gt;/" -l --absolute --profile volume-check</w:t>
+      </w:r>
+    </w:p>
+    <w:p>
+      <w:pPr>
+        <w:ind w:left="259" w:hanging="259"/>
+      </w:pPr>
+      <w:r>
+        <w:rPr>
+          <w:b/>
+        </w:rPr>
+        <w:t xml:space="preserve">4. </w:t>
+      </w:r>
+      <w:r>
+        <w:rPr>
+          <w:b/>
+        </w:rPr>
+        <w:t xml:space="preserve">Check the result. </w:t>
+      </w:r>
+      <w:r>
+        <w:t>The long listing includes file size and full path. Match the ZIP filename to the downloaded archive, confirm size is greater than zero, and record the full path. If the file is absent, confirm the folder path, selected workspace profile, and your volume permissions.</w:t>
+      </w:r>
     </w:p>
     <w:p>
       <w:r>
@@ -3655,11 +3793,6 @@
       </w:r>
     </w:p>
     <w:p>
-      <w:r>
-        <w:br w:type="page"/>
-      </w:r>
-    </w:p>
-    <w:p>
       <w:pPr>
         <w:pStyle w:val="Heading1"/>
       </w:pPr>
@@ -3970,12 +4103,46 @@
             <w:color w:val="1F4E79"/>
             <w:u w:val="single"/>
           </w:rPr>
+          <w:t>Azure Databricks CLI installation</w:t>
+        </w:r>
+      </w:hyperlink>
+    </w:p>
+    <w:p>
+      <w:pPr>
+        <w:spacing w:after="40"/>
+      </w:pPr>
+      <w:r>
+        <w:t xml:space="preserve">11. </w:t>
+      </w:r>
+      <w:hyperlink r:id="rId19">
+        <w:r>
+          <w:rPr>
+            <w:color w:val="1F4E79"/>
+            <w:u w:val="single"/>
+          </w:rPr>
+          <w:t>Azure Databricks CLI authentication</w:t>
+        </w:r>
+      </w:hyperlink>
+    </w:p>
+    <w:p>
+      <w:pPr>
+        <w:spacing w:after="40"/>
+      </w:pPr>
+      <w:r>
+        <w:t xml:space="preserve">12. </w:t>
+      </w:r>
+      <w:hyperlink r:id="rId20">
+        <w:r>
+          <w:rPr>
+            <w:color w:val="1F4E79"/>
+            <w:u w:val="single"/>
+          </w:rPr>
           <w:t>Azure Databricks upload files to a volume</w:t>
         </w:r>
       </w:hyperlink>
     </w:p>
     <w:sectPr>
-      <w:footerReference w:type="default" r:id="rId19"/>
+      <w:footerReference w:type="default" r:id="rId21"/>
       <w:pgSz w:w="11909" w:h="16834"/>
       <w:pgMar w:top="1037" w:right="1195" w:bottom="1037" w:left="1195" w:header="720" w:footer="720" w:gutter="0"/>
       <w:cols w:space="720"/>

</xml_diff>